<commit_message>
Lots of smaller detail updates. Updated to v15.
</commit_message>
<xml_diff>
--- a/Acquired Asset Originals/Asset Credits.docx
+++ b/Acquired Asset Originals/Asset Credits.docx
@@ -321,6 +321,28 @@
       </w:r>
     </w:p>
     <w:p>
+      <w:r>
+        <w:t>"Medieval Chandelier" (</w:t>
+      </w:r>
+      <w:hyperlink r:id="rId18" w:history="1">
+        <w:r>
+          <w:rPr>
+            <w:rStyle w:val="Hyperlink"/>
+          </w:rPr>
+          <w:t>https://skfb.ly/6SHqT</w:t>
+        </w:r>
+      </w:hyperlink>
+      <w:r>
+        <w:t>)</w:t>
+      </w:r>
+      <w:r>
+        <w:t xml:space="preserve"> </w:t>
+      </w:r>
+      <w:r>
+        <w:t>by Kevin.Popescu</w:t>
+      </w:r>
+    </w:p>
+    <w:p>
       <w:pPr>
         <w:jc w:val="center"/>
         <w:rPr>
@@ -346,24 +368,12 @@
       <w:r>
         <w:t>” (</w:t>
       </w:r>
-      <w:hyperlink r:id="rId18" w:history="1">
+      <w:hyperlink r:id="rId19" w:history="1">
         <w:r>
           <w:rPr>
             <w:rStyle w:val="Hyperlink"/>
           </w:rPr>
-          <w:t>https://www.cgtrader.com/products/old-magic-boo</w:t>
-        </w:r>
-        <w:r>
-          <w:rPr>
-            <w:rStyle w:val="Hyperlink"/>
-          </w:rPr>
-          <w:t>k</w:t>
-        </w:r>
-        <w:r>
-          <w:rPr>
-            <w:rStyle w:val="Hyperlink"/>
-          </w:rPr>
-          <w:t>shelf</w:t>
+          <w:t>https://www.cgtrader.com/products/old-magic-bookshelf</w:t>
         </w:r>
       </w:hyperlink>
       <w:r>

</xml_diff>

<commit_message>
Romantasy small details added, infinite bookcase bright & seams fixed.
</commit_message>
<xml_diff>
--- a/Acquired Asset Originals/Asset Credits.docx
+++ b/Acquired Asset Originals/Asset Credits.docx
@@ -15,377 +15,480 @@
           <w:b/>
           <w:bCs/>
         </w:rPr>
-        <w:t>From Sketchfab, licensed under Creative Commons Attribution (http://creativecommons.org/licenses/by/4.0/):</w:t>
-      </w:r>
-    </w:p>
-    <w:p>
-      <w:r>
-        <w:t>"Sofa 4 | 3DX" (</w:t>
-      </w:r>
-      <w:hyperlink r:id="rId4" w:history="1">
-        <w:r>
-          <w:rPr>
-            <w:rStyle w:val="Hyperlink"/>
-          </w:rPr>
-          <w:t>https://skfb.ly/oRrut</w:t>
-        </w:r>
-      </w:hyperlink>
-      <w:r>
-        <w:t>)</w:t>
-      </w:r>
-      <w:r>
-        <w:t xml:space="preserve"> </w:t>
-      </w:r>
-      <w:r>
-        <w:t>by Snowism</w:t>
-      </w:r>
-    </w:p>
-    <w:p>
-      <w:r>
-        <w:t>"Old Chair" (</w:t>
-      </w:r>
-      <w:hyperlink r:id="rId5" w:history="1">
-        <w:r>
-          <w:rPr>
-            <w:rStyle w:val="Hyperlink"/>
-          </w:rPr>
-          <w:t>https://skfb.ly/6T6VF</w:t>
-        </w:r>
-      </w:hyperlink>
-      <w:r>
-        <w:t>)</w:t>
-      </w:r>
-      <w:r>
-        <w:t xml:space="preserve"> </w:t>
-      </w:r>
-      <w:r>
-        <w:t>by A18K</w:t>
-      </w:r>
-    </w:p>
-    <w:p>
-      <w:r>
-        <w:t>"Bean Bag Chair" (</w:t>
-      </w:r>
-      <w:hyperlink r:id="rId6" w:history="1">
-        <w:r>
-          <w:rPr>
-            <w:rStyle w:val="Hyperlink"/>
-          </w:rPr>
-          <w:t>https://skfb.ly/RQRt</w:t>
-        </w:r>
-      </w:hyperlink>
-      <w:r>
-        <w:t>)</w:t>
-      </w:r>
-      <w:r>
-        <w:t xml:space="preserve"> </w:t>
-      </w:r>
-      <w:r>
-        <w:t>by khanhnguyen1189</w:t>
-      </w:r>
-    </w:p>
-    <w:p>
-      <w:r>
-        <w:t>"Stained Glass Window" (</w:t>
-      </w:r>
-      <w:hyperlink r:id="rId7" w:history="1">
-        <w:r>
-          <w:rPr>
-            <w:rStyle w:val="Hyperlink"/>
-          </w:rPr>
-          <w:t>https://skfb.ly/oGySP</w:t>
-        </w:r>
-      </w:hyperlink>
-      <w:r>
-        <w:t>)</w:t>
-      </w:r>
-      <w:r>
-        <w:t xml:space="preserve"> </w:t>
-      </w:r>
-      <w:r>
-        <w:t>by mejack</w:t>
-      </w:r>
-    </w:p>
-    <w:p>
-      <w:r>
-        <w:t>"low poly Ivy" (</w:t>
-      </w:r>
-      <w:hyperlink r:id="rId8" w:history="1">
-        <w:r>
-          <w:rPr>
-            <w:rStyle w:val="Hyperlink"/>
-          </w:rPr>
-          <w:t>https://skfb.ly/ovOCP</w:t>
-        </w:r>
-      </w:hyperlink>
-      <w:r>
-        <w:t>)</w:t>
-      </w:r>
-      <w:r>
-        <w:t xml:space="preserve"> </w:t>
-      </w:r>
-      <w:r>
-        <w:t>by spicybamer</w:t>
-      </w:r>
-    </w:p>
-    <w:p>
-      <w:r>
-        <w:t>"PICTURE FRAME 15*20 dimensions" (</w:t>
-      </w:r>
-      <w:hyperlink r:id="rId9" w:history="1">
-        <w:r>
-          <w:rPr>
-            <w:rStyle w:val="Hyperlink"/>
-          </w:rPr>
-          <w:t>https://skfb.ly/ouyDV</w:t>
-        </w:r>
-      </w:hyperlink>
-      <w:r>
-        <w:t>)</w:t>
-      </w:r>
-      <w:r>
-        <w:t xml:space="preserve"> </w:t>
-      </w:r>
-      <w:r>
-        <w:t>by Fred Drabble</w:t>
-      </w:r>
-    </w:p>
-    <w:p>
-      <w:r>
-        <w:t>"Fireplace scene" (</w:t>
-      </w:r>
-      <w:hyperlink r:id="rId10" w:history="1">
-        <w:r>
-          <w:rPr>
-            <w:rStyle w:val="Hyperlink"/>
-          </w:rPr>
-          <w:t>https://skfb.ly/6S7XZ</w:t>
-        </w:r>
-      </w:hyperlink>
-      <w:r>
-        <w:t>)</w:t>
-      </w:r>
-      <w:r>
-        <w:t xml:space="preserve"> </w:t>
-      </w:r>
-      <w:r>
-        <w:t>by inboundingbox</w:t>
-      </w:r>
-    </w:p>
-    <w:p>
-      <w:r>
-        <w:t>"Fireplace" (</w:t>
-      </w:r>
-      <w:hyperlink r:id="rId11" w:history="1">
-        <w:r>
-          <w:rPr>
-            <w:rStyle w:val="Hyperlink"/>
-          </w:rPr>
-          <w:t>https://skfb.ly/6ZvwX</w:t>
-        </w:r>
-      </w:hyperlink>
-      <w:r>
-        <w:t>)</w:t>
-      </w:r>
-      <w:r>
-        <w:t xml:space="preserve"> </w:t>
-      </w:r>
-      <w:r>
-        <w:t>by AnnaBelle Fibonacci</w:t>
-      </w:r>
-    </w:p>
-    <w:p>
-      <w:r>
-        <w:t>"Dusty bookshelfs" (</w:t>
-      </w:r>
-      <w:hyperlink r:id="rId12" w:history="1">
-        <w:r>
-          <w:rPr>
-            <w:rStyle w:val="Hyperlink"/>
-          </w:rPr>
-          <w:t>https://skfb.ly/orv9K</w:t>
-        </w:r>
-      </w:hyperlink>
-      <w:r>
-        <w:t>)</w:t>
-      </w:r>
-      <w:r>
-        <w:t xml:space="preserve"> </w:t>
-      </w:r>
-      <w:r>
-        <w:t>by Meanphrog</w:t>
-      </w:r>
-    </w:p>
-    <w:p>
-      <w:r>
-        <w:t>"DeLux Bookshelf" (</w:t>
-      </w:r>
-      <w:hyperlink r:id="rId13" w:history="1">
-        <w:r>
-          <w:rPr>
-            <w:rStyle w:val="Hyperlink"/>
-          </w:rPr>
-          <w:t>https://skfb.ly/6WYOJ</w:t>
-        </w:r>
-      </w:hyperlink>
-      <w:r>
-        <w:t>)</w:t>
-      </w:r>
-      <w:r>
-        <w:t xml:space="preserve"> </w:t>
-      </w:r>
-      <w:r>
-        <w:t>by Heliona</w:t>
-      </w:r>
-    </w:p>
-    <w:p>
-      <w:r>
-        <w:t>"Circular Wooden Bookshelf" (</w:t>
-      </w:r>
-      <w:hyperlink r:id="rId14" w:history="1">
-        <w:r>
-          <w:rPr>
-            <w:rStyle w:val="Hyperlink"/>
-          </w:rPr>
-          <w:t>https://skfb.ly/orv8K</w:t>
-        </w:r>
-      </w:hyperlink>
-      <w:r>
-        <w:t>) by FordVFX</w:t>
-      </w:r>
-    </w:p>
-    <w:p>
-      <w:r>
-        <w:t>"Antique wooden bookcase - Game model" (</w:t>
-      </w:r>
-      <w:hyperlink r:id="rId15" w:history="1">
-        <w:r>
-          <w:rPr>
-            <w:rStyle w:val="Hyperlink"/>
-          </w:rPr>
-          <w:t>https://skfb.ly/orwXu</w:t>
-        </w:r>
-      </w:hyperlink>
-      <w:r>
-        <w:t>)</w:t>
-      </w:r>
-      <w:r>
-        <w:t xml:space="preserve"> </w:t>
-      </w:r>
-      <w:r>
-        <w:t>by Lorenzo Drago</w:t>
-      </w:r>
-    </w:p>
-    <w:p>
-      <w:r>
-        <w:t>"Gothic Table" (</w:t>
-      </w:r>
-      <w:hyperlink r:id="rId16" w:history="1">
-        <w:r>
-          <w:rPr>
-            <w:rStyle w:val="Hyperlink"/>
-          </w:rPr>
-          <w:t>https://skfb.ly/6CE9u</w:t>
-        </w:r>
-      </w:hyperlink>
-      <w:r>
-        <w:t>)</w:t>
-      </w:r>
-      <w:r>
-        <w:t xml:space="preserve"> </w:t>
-      </w:r>
-      <w:r>
-        <w:t>by Dirtrock</w:t>
-      </w:r>
-    </w:p>
-    <w:p>
-      <w:r>
-        <w:t>"Modern Table with Steel and Carrara Marble" (</w:t>
-      </w:r>
-      <w:hyperlink r:id="rId17" w:history="1">
-        <w:r>
-          <w:rPr>
-            <w:rStyle w:val="Hyperlink"/>
-          </w:rPr>
-          <w:t>https://skfb.ly/69rrA</w:t>
-        </w:r>
-      </w:hyperlink>
-      <w:r>
-        <w:t>)</w:t>
-      </w:r>
-      <w:r>
-        <w:t xml:space="preserve"> </w:t>
-      </w:r>
-      <w:r>
-        <w:t>by alexandro.g</w:t>
-      </w:r>
-    </w:p>
-    <w:p>
-      <w:r>
-        <w:t>"Medieval Chandelier" (</w:t>
-      </w:r>
-      <w:hyperlink r:id="rId18" w:history="1">
-        <w:r>
-          <w:rPr>
-            <w:rStyle w:val="Hyperlink"/>
-          </w:rPr>
-          <w:t>https://skfb.ly/6SHqT</w:t>
-        </w:r>
-      </w:hyperlink>
-      <w:r>
-        <w:t>)</w:t>
-      </w:r>
-      <w:r>
-        <w:t xml:space="preserve"> </w:t>
-      </w:r>
-      <w:r>
-        <w:t>by Kevin.Popescu</w:t>
-      </w:r>
-    </w:p>
-    <w:p>
-      <w:r>
-        <w:t>"Chocolate Heart - Valentine´s Day" (</w:t>
-      </w:r>
-      <w:hyperlink r:id="rId19" w:history="1">
-        <w:r>
-          <w:rPr>
-            <w:rStyle w:val="Hyperlink"/>
-          </w:rPr>
-          <w:t>https://skfb.ly/prSPP</w:t>
-        </w:r>
-      </w:hyperlink>
-      <w:r>
-        <w:t>)</w:t>
-      </w:r>
-      <w:r>
-        <w:t xml:space="preserve"> </w:t>
-      </w:r>
-      <w:r>
-        <w:t>by ByapY</w:t>
-      </w:r>
-    </w:p>
-    <w:p>
-      <w:pPr>
-        <w:jc w:val="center"/>
+        <w:t>All assets acquired from</w:t>
+      </w:r>
+      <w:r>
         <w:rPr>
           <w:b/>
           <w:bCs/>
         </w:rPr>
-      </w:pPr>
+        <w:t xml:space="preserve"> </w:t>
+      </w:r>
       <w:r>
         <w:rPr>
           <w:b/>
           <w:bCs/>
         </w:rPr>
-        <w:t>From CGTrader, Royalty Free:</w:t>
-      </w:r>
+        <w:t>Fab/</w:t>
+      </w:r>
+      <w:proofErr w:type="spellStart"/>
+      <w:r>
+        <w:rPr>
+          <w:b/>
+          <w:bCs/>
+        </w:rPr>
+        <w:t>Sketchfab</w:t>
+      </w:r>
+      <w:proofErr w:type="spellEnd"/>
+      <w:r>
+        <w:rPr>
+          <w:b/>
+          <w:bCs/>
+        </w:rPr>
+        <w:t>, licensed under Creative Commons Attribution (http://creativecommons.org/licenses/by/4.0/):</w:t>
+      </w:r>
+    </w:p>
+    <w:p>
+      <w:r>
+        <w:t>"Sofa 4 | 3DX" (</w:t>
+      </w:r>
+      <w:hyperlink r:id="rId4" w:history="1">
+        <w:r>
+          <w:rPr>
+            <w:rStyle w:val="Hyperlink"/>
+          </w:rPr>
+          <w:t>https://skfb.ly/oRrut</w:t>
+        </w:r>
+      </w:hyperlink>
+      <w:r>
+        <w:t>)</w:t>
+      </w:r>
+      <w:r>
+        <w:t xml:space="preserve"> </w:t>
+      </w:r>
+      <w:r>
+        <w:t xml:space="preserve">by </w:t>
+      </w:r>
+      <w:proofErr w:type="spellStart"/>
+      <w:r>
+        <w:t>Snowism</w:t>
+      </w:r>
+      <w:proofErr w:type="spellEnd"/>
+    </w:p>
+    <w:p>
+      <w:r>
+        <w:t>"Old Chair" (</w:t>
+      </w:r>
+      <w:hyperlink r:id="rId5" w:history="1">
+        <w:r>
+          <w:rPr>
+            <w:rStyle w:val="Hyperlink"/>
+          </w:rPr>
+          <w:t>https://skfb.ly/6T6VF</w:t>
+        </w:r>
+      </w:hyperlink>
+      <w:r>
+        <w:t>)</w:t>
+      </w:r>
+      <w:r>
+        <w:t xml:space="preserve"> </w:t>
+      </w:r>
+      <w:r>
+        <w:t>by A18K</w:t>
+      </w:r>
+    </w:p>
+    <w:p>
+      <w:r>
+        <w:t>"Bean Bag Chair" (</w:t>
+      </w:r>
+      <w:hyperlink r:id="rId6" w:history="1">
+        <w:r>
+          <w:rPr>
+            <w:rStyle w:val="Hyperlink"/>
+          </w:rPr>
+          <w:t>https://skfb.ly/RQRt</w:t>
+        </w:r>
+      </w:hyperlink>
+      <w:r>
+        <w:t>)</w:t>
+      </w:r>
+      <w:r>
+        <w:t xml:space="preserve"> </w:t>
+      </w:r>
+      <w:r>
+        <w:t>by khanhnguyen1189</w:t>
+      </w:r>
+    </w:p>
+    <w:p>
+      <w:r>
+        <w:t>"Stained Glass Window" (</w:t>
+      </w:r>
+      <w:hyperlink r:id="rId7" w:history="1">
+        <w:r>
+          <w:rPr>
+            <w:rStyle w:val="Hyperlink"/>
+          </w:rPr>
+          <w:t>https://skfb.ly/oGySP</w:t>
+        </w:r>
+      </w:hyperlink>
+      <w:r>
+        <w:t>)</w:t>
+      </w:r>
+      <w:r>
+        <w:t xml:space="preserve"> </w:t>
+      </w:r>
+      <w:r>
+        <w:t xml:space="preserve">by </w:t>
+      </w:r>
+      <w:proofErr w:type="spellStart"/>
+      <w:r>
+        <w:t>mejack</w:t>
+      </w:r>
+      <w:proofErr w:type="spellEnd"/>
+    </w:p>
+    <w:p>
+      <w:r>
+        <w:t>"</w:t>
+      </w:r>
+      <w:proofErr w:type="gramStart"/>
+      <w:r>
+        <w:t>low</w:t>
+      </w:r>
+      <w:proofErr w:type="gramEnd"/>
+      <w:r>
+        <w:t xml:space="preserve"> poly Ivy" (</w:t>
+      </w:r>
+      <w:hyperlink r:id="rId8" w:history="1">
+        <w:r>
+          <w:rPr>
+            <w:rStyle w:val="Hyperlink"/>
+          </w:rPr>
+          <w:t>https://skfb.ly/ovOCP</w:t>
+        </w:r>
+      </w:hyperlink>
+      <w:r>
+        <w:t>)</w:t>
+      </w:r>
+      <w:r>
+        <w:t xml:space="preserve"> </w:t>
+      </w:r>
+      <w:r>
+        <w:t xml:space="preserve">by </w:t>
+      </w:r>
+      <w:proofErr w:type="spellStart"/>
+      <w:r>
+        <w:t>spicybamer</w:t>
+      </w:r>
+      <w:proofErr w:type="spellEnd"/>
+    </w:p>
+    <w:p>
+      <w:r>
+        <w:t>"PICTURE FRAME 15*20 dimensions" (</w:t>
+      </w:r>
+      <w:hyperlink r:id="rId9" w:history="1">
+        <w:r>
+          <w:rPr>
+            <w:rStyle w:val="Hyperlink"/>
+          </w:rPr>
+          <w:t>https://skfb.ly/ouyDV</w:t>
+        </w:r>
+      </w:hyperlink>
+      <w:r>
+        <w:t>)</w:t>
+      </w:r>
+      <w:r>
+        <w:t xml:space="preserve"> </w:t>
+      </w:r>
+      <w:r>
+        <w:t>by Fred Drabble</w:t>
+      </w:r>
+    </w:p>
+    <w:p>
+      <w:r>
+        <w:t>"Fireplace scene" (</w:t>
+      </w:r>
+      <w:hyperlink r:id="rId10" w:history="1">
+        <w:r>
+          <w:rPr>
+            <w:rStyle w:val="Hyperlink"/>
+          </w:rPr>
+          <w:t>https://skfb.ly/6S7XZ</w:t>
+        </w:r>
+      </w:hyperlink>
+      <w:r>
+        <w:t>)</w:t>
+      </w:r>
+      <w:r>
+        <w:t xml:space="preserve"> </w:t>
+      </w:r>
+      <w:r>
+        <w:t xml:space="preserve">by </w:t>
+      </w:r>
+      <w:proofErr w:type="spellStart"/>
+      <w:r>
+        <w:t>inboundingbox</w:t>
+      </w:r>
+      <w:proofErr w:type="spellEnd"/>
+    </w:p>
+    <w:p>
+      <w:r>
+        <w:t>"Fireplace" (</w:t>
+      </w:r>
+      <w:hyperlink r:id="rId11" w:history="1">
+        <w:r>
+          <w:rPr>
+            <w:rStyle w:val="Hyperlink"/>
+          </w:rPr>
+          <w:t>https://skfb.ly/6ZvwX</w:t>
+        </w:r>
+      </w:hyperlink>
+      <w:r>
+        <w:t>)</w:t>
+      </w:r>
+      <w:r>
+        <w:t xml:space="preserve"> </w:t>
+      </w:r>
+      <w:r>
+        <w:t xml:space="preserve">by </w:t>
+      </w:r>
+      <w:proofErr w:type="spellStart"/>
+      <w:r>
+        <w:t>AnnaBelle</w:t>
+      </w:r>
+      <w:proofErr w:type="spellEnd"/>
+      <w:r>
+        <w:t xml:space="preserve"> Fibonacci</w:t>
+      </w:r>
+    </w:p>
+    <w:p>
+      <w:r>
+        <w:t xml:space="preserve">"Dusty </w:t>
+      </w:r>
+      <w:proofErr w:type="spellStart"/>
+      <w:r>
+        <w:t>bookshelfs</w:t>
+      </w:r>
+      <w:proofErr w:type="spellEnd"/>
+      <w:r>
+        <w:t>" (</w:t>
+      </w:r>
+      <w:hyperlink r:id="rId12" w:history="1">
+        <w:r>
+          <w:rPr>
+            <w:rStyle w:val="Hyperlink"/>
+          </w:rPr>
+          <w:t>https://skfb.ly/orv9K</w:t>
+        </w:r>
+      </w:hyperlink>
+      <w:r>
+        <w:t>)</w:t>
+      </w:r>
+      <w:r>
+        <w:t xml:space="preserve"> </w:t>
+      </w:r>
+      <w:r>
+        <w:t xml:space="preserve">by </w:t>
+      </w:r>
+      <w:proofErr w:type="spellStart"/>
+      <w:r>
+        <w:t>Meanphrog</w:t>
+      </w:r>
+      <w:proofErr w:type="spellEnd"/>
+    </w:p>
+    <w:p>
+      <w:r>
+        <w:t>"</w:t>
+      </w:r>
+      <w:proofErr w:type="spellStart"/>
+      <w:r>
+        <w:t>DeLux</w:t>
+      </w:r>
+      <w:proofErr w:type="spellEnd"/>
+      <w:r>
+        <w:t xml:space="preserve"> Bookshelf" (</w:t>
+      </w:r>
+      <w:hyperlink r:id="rId13" w:history="1">
+        <w:r>
+          <w:rPr>
+            <w:rStyle w:val="Hyperlink"/>
+          </w:rPr>
+          <w:t>https://skfb.ly/6WYOJ</w:t>
+        </w:r>
+      </w:hyperlink>
+      <w:r>
+        <w:t>)</w:t>
+      </w:r>
+      <w:r>
+        <w:t xml:space="preserve"> </w:t>
+      </w:r>
+      <w:r>
+        <w:t xml:space="preserve">by </w:t>
+      </w:r>
+      <w:proofErr w:type="spellStart"/>
+      <w:r>
+        <w:t>Heliona</w:t>
+      </w:r>
+      <w:proofErr w:type="spellEnd"/>
+    </w:p>
+    <w:p>
+      <w:r>
+        <w:t>"Circular Wooden Bookshelf" (</w:t>
+      </w:r>
+      <w:hyperlink r:id="rId14" w:history="1">
+        <w:r>
+          <w:rPr>
+            <w:rStyle w:val="Hyperlink"/>
+          </w:rPr>
+          <w:t>https://skfb.ly/orv8K</w:t>
+        </w:r>
+      </w:hyperlink>
+      <w:r>
+        <w:t xml:space="preserve">) by </w:t>
+      </w:r>
+      <w:proofErr w:type="spellStart"/>
+      <w:r>
+        <w:t>FordVFX</w:t>
+      </w:r>
+      <w:proofErr w:type="spellEnd"/>
+    </w:p>
+    <w:p>
+      <w:r>
+        <w:t>"Antique wooden bookcase - Game model" (</w:t>
+      </w:r>
+      <w:hyperlink r:id="rId15" w:history="1">
+        <w:r>
+          <w:rPr>
+            <w:rStyle w:val="Hyperlink"/>
+          </w:rPr>
+          <w:t>https://skfb.ly/orwXu</w:t>
+        </w:r>
+      </w:hyperlink>
+      <w:r>
+        <w:t>)</w:t>
+      </w:r>
+      <w:r>
+        <w:t xml:space="preserve"> </w:t>
+      </w:r>
+      <w:r>
+        <w:t>by Lorenzo Drago</w:t>
+      </w:r>
+    </w:p>
+    <w:p>
+      <w:r>
+        <w:t>"Gothic Table" (</w:t>
+      </w:r>
+      <w:hyperlink r:id="rId16" w:history="1">
+        <w:r>
+          <w:rPr>
+            <w:rStyle w:val="Hyperlink"/>
+          </w:rPr>
+          <w:t>https://skfb.ly/6CE9u</w:t>
+        </w:r>
+      </w:hyperlink>
+      <w:r>
+        <w:t>)</w:t>
+      </w:r>
+      <w:r>
+        <w:t xml:space="preserve"> </w:t>
+      </w:r>
+      <w:r>
+        <w:t xml:space="preserve">by </w:t>
+      </w:r>
+      <w:proofErr w:type="spellStart"/>
+      <w:r>
+        <w:t>Dirtrock</w:t>
+      </w:r>
+      <w:proofErr w:type="spellEnd"/>
+    </w:p>
+    <w:p>
+      <w:r>
+        <w:t>"Modern Table with Steel and Carrara Marble" (</w:t>
+      </w:r>
+      <w:hyperlink r:id="rId17" w:history="1">
+        <w:r>
+          <w:rPr>
+            <w:rStyle w:val="Hyperlink"/>
+          </w:rPr>
+          <w:t>https://skfb.ly/69rrA</w:t>
+        </w:r>
+      </w:hyperlink>
+      <w:r>
+        <w:t>)</w:t>
+      </w:r>
+      <w:r>
+        <w:t xml:space="preserve"> </w:t>
+      </w:r>
+      <w:r>
+        <w:t xml:space="preserve">by </w:t>
+      </w:r>
+      <w:proofErr w:type="spellStart"/>
+      <w:proofErr w:type="gramStart"/>
+      <w:r>
+        <w:t>alexandro.g</w:t>
+      </w:r>
+      <w:proofErr w:type="spellEnd"/>
+      <w:proofErr w:type="gramEnd"/>
+    </w:p>
+    <w:p>
+      <w:r>
+        <w:t>"Medieval Chandelier" (</w:t>
+      </w:r>
+      <w:hyperlink r:id="rId18" w:history="1">
+        <w:r>
+          <w:rPr>
+            <w:rStyle w:val="Hyperlink"/>
+          </w:rPr>
+          <w:t>https://skfb.ly/6SHqT</w:t>
+        </w:r>
+      </w:hyperlink>
+      <w:r>
+        <w:t>)</w:t>
+      </w:r>
+      <w:r>
+        <w:t xml:space="preserve"> </w:t>
+      </w:r>
+      <w:r>
+        <w:t xml:space="preserve">by </w:t>
+      </w:r>
+      <w:proofErr w:type="spellStart"/>
+      <w:r>
+        <w:t>Kevin.Popescu</w:t>
+      </w:r>
+      <w:proofErr w:type="spellEnd"/>
+    </w:p>
+    <w:p>
+      <w:r>
+        <w:t>"Chocolate Heart - Valentine´s Day" (</w:t>
+      </w:r>
+      <w:hyperlink r:id="rId19" w:history="1">
+        <w:r>
+          <w:rPr>
+            <w:rStyle w:val="Hyperlink"/>
+          </w:rPr>
+          <w:t>https://skfb.ly/prSPP</w:t>
+        </w:r>
+      </w:hyperlink>
+      <w:r>
+        <w:t>)</w:t>
+      </w:r>
+      <w:r>
+        <w:t xml:space="preserve"> </w:t>
+      </w:r>
+      <w:r>
+        <w:t xml:space="preserve">by </w:t>
+      </w:r>
+      <w:proofErr w:type="spellStart"/>
+      <w:r>
+        <w:t>ByapY</w:t>
+      </w:r>
+      <w:proofErr w:type="spellEnd"/>
     </w:p>
     <w:p>
       <w:r>
         <w:t>“</w:t>
       </w:r>
       <w:r>
-        <w:t>Old Magic Bookshelf</w:t>
+        <w:t>Art Studio VR</w:t>
       </w:r>
       <w:r>
         <w:t>” (</w:t>
@@ -395,20 +498,300 @@
           <w:rPr>
             <w:rStyle w:val="Hyperlink"/>
           </w:rPr>
-          <w:t>https://www.cgtrader.com/products/old-magic-bookshelf</w:t>
-        </w:r>
-      </w:hyperlink>
-      <w:r>
-        <w:t>)</w:t>
+          <w:t>https://fab.com/s/ecb39fd81784</w:t>
+        </w:r>
+      </w:hyperlink>
+      <w:r>
+        <w:t>) by AK STUDIO ART</w:t>
+      </w:r>
+    </w:p>
+    <w:p>
+      <w:r>
+        <w:t>“</w:t>
+      </w:r>
+      <w:r>
+        <w:t>Bank Building / Interior</w:t>
+      </w:r>
+      <w:r>
+        <w:t>” (</w:t>
+      </w:r>
+      <w:hyperlink r:id="rId21" w:history="1">
+        <w:r>
+          <w:rPr>
+            <w:rStyle w:val="Hyperlink"/>
+          </w:rPr>
+          <w:t>https://fab.com/s/0c87ef544eb0</w:t>
+        </w:r>
+      </w:hyperlink>
+      <w:r>
+        <w:t xml:space="preserve">) by </w:t>
+      </w:r>
+      <w:proofErr w:type="spellStart"/>
+      <w:r>
+        <w:t>Leartes</w:t>
+      </w:r>
+      <w:proofErr w:type="spellEnd"/>
+      <w:r>
+        <w:t xml:space="preserve"> Studios</w:t>
+      </w:r>
+    </w:p>
+    <w:p>
+      <w:r>
+        <w:t>“</w:t>
+      </w:r>
+      <w:r>
+        <w:t>English Cottage Interior</w:t>
+      </w:r>
+      <w:r>
+        <w:t>” (</w:t>
+      </w:r>
+      <w:hyperlink r:id="rId22" w:history="1">
+        <w:r>
+          <w:rPr>
+            <w:rStyle w:val="Hyperlink"/>
+          </w:rPr>
+          <w:t>https://fab.com/s/5d626bc98c17</w:t>
+        </w:r>
+      </w:hyperlink>
+      <w:r>
+        <w:t xml:space="preserve">) by </w:t>
+      </w:r>
+      <w:proofErr w:type="spellStart"/>
+      <w:r>
+        <w:t>Leartes</w:t>
+      </w:r>
+      <w:proofErr w:type="spellEnd"/>
+      <w:r>
+        <w:t xml:space="preserve"> Studios</w:t>
+      </w:r>
+    </w:p>
+    <w:p>
+      <w:r>
+        <w:t>“</w:t>
+      </w:r>
+      <w:r>
+        <w:t>Fantasy Interior Environment</w:t>
+      </w:r>
+      <w:r>
+        <w:t>” (</w:t>
+      </w:r>
+      <w:hyperlink r:id="rId23" w:history="1">
+        <w:r>
+          <w:rPr>
+            <w:rStyle w:val="Hyperlink"/>
+          </w:rPr>
+          <w:t>https://fab.com/s/a2ee5c92f7b3</w:t>
+        </w:r>
+      </w:hyperlink>
+      <w:r>
+        <w:t xml:space="preserve">) </w:t>
+      </w:r>
+      <w:r>
+        <w:t xml:space="preserve">by </w:t>
+      </w:r>
+      <w:proofErr w:type="spellStart"/>
+      <w:r>
+        <w:t>Leartes</w:t>
+      </w:r>
+      <w:proofErr w:type="spellEnd"/>
+      <w:r>
+        <w:t xml:space="preserve"> Studios</w:t>
+      </w:r>
+    </w:p>
+    <w:p>
+      <w:r>
+        <w:t>“</w:t>
+      </w:r>
+      <w:r>
+        <w:t>Triplex House Villa</w:t>
+      </w:r>
+      <w:r>
+        <w:t>” (</w:t>
+      </w:r>
+      <w:hyperlink r:id="rId24" w:history="1">
+        <w:r>
+          <w:rPr>
+            <w:rStyle w:val="Hyperlink"/>
+          </w:rPr>
+          <w:t>https://fab.com/s/43313e70459f</w:t>
+        </w:r>
+      </w:hyperlink>
+      <w:r>
+        <w:t>) by 1DSTUDIO</w:t>
+      </w:r>
+    </w:p>
+    <w:p>
+      <w:r>
+        <w:t>“</w:t>
+      </w:r>
+      <w:r>
+        <w:t>Fantasy</w:t>
       </w:r>
       <w:r>
         <w:t xml:space="preserve"> </w:t>
       </w:r>
       <w:r>
-        <w:t xml:space="preserve">by </w:t>
-      </w:r>
-      <w:r>
-        <w:t>harudevua</w:t>
+        <w:t>Sword</w:t>
+      </w:r>
+      <w:r>
+        <w:t>” (</w:t>
+      </w:r>
+      <w:hyperlink r:id="rId25" w:history="1">
+        <w:r>
+          <w:rPr>
+            <w:rStyle w:val="Hyperlink"/>
+          </w:rPr>
+          <w:t>https://fab.com/s/952cd34df487</w:t>
+        </w:r>
+      </w:hyperlink>
+      <w:r>
+        <w:t xml:space="preserve">) by </w:t>
+      </w:r>
+      <w:proofErr w:type="spellStart"/>
+      <w:r>
+        <w:t>Nillusion</w:t>
+      </w:r>
+      <w:proofErr w:type="spellEnd"/>
+    </w:p>
+    <w:p>
+      <w:r>
+        <w:t>“Runic Sword” (</w:t>
+      </w:r>
+      <w:hyperlink r:id="rId26" w:history="1">
+        <w:r>
+          <w:rPr>
+            <w:rStyle w:val="Hyperlink"/>
+          </w:rPr>
+          <w:t>https://fab.com/s/d0b813a71d36</w:t>
+        </w:r>
+      </w:hyperlink>
+      <w:r>
+        <w:t xml:space="preserve">) by </w:t>
+      </w:r>
+      <w:proofErr w:type="spellStart"/>
+      <w:r>
+        <w:t>sanekcl</w:t>
+      </w:r>
+      <w:proofErr w:type="spellEnd"/>
+    </w:p>
+    <w:p>
+      <w:r>
+        <w:t>“</w:t>
+      </w:r>
+      <w:r>
+        <w:t>Ornate Medieval Shield</w:t>
+      </w:r>
+      <w:r>
+        <w:t>” (</w:t>
+      </w:r>
+      <w:hyperlink r:id="rId27" w:history="1">
+        <w:r>
+          <w:rPr>
+            <w:rStyle w:val="Hyperlink"/>
+          </w:rPr>
+          <w:t>https://fab.com/s/3046100bcd28</w:t>
+        </w:r>
+      </w:hyperlink>
+      <w:r>
+        <w:t xml:space="preserve">) by </w:t>
+      </w:r>
+      <w:proofErr w:type="spellStart"/>
+      <w:r>
+        <w:t>CaptainHC</w:t>
+      </w:r>
+      <w:proofErr w:type="spellEnd"/>
+    </w:p>
+    <w:p>
+      <w:r>
+        <w:t>“</w:t>
+      </w:r>
+      <w:r>
+        <w:t>Magic Potion</w:t>
+      </w:r>
+      <w:r>
+        <w:t>” (</w:t>
+      </w:r>
+      <w:hyperlink r:id="rId28" w:history="1">
+        <w:r>
+          <w:rPr>
+            <w:rStyle w:val="Hyperlink"/>
+          </w:rPr>
+          <w:t>https://fab.com/s/1b428cca34bf</w:t>
+        </w:r>
+      </w:hyperlink>
+      <w:r>
+        <w:t xml:space="preserve">) by </w:t>
+      </w:r>
+      <w:proofErr w:type="spellStart"/>
+      <w:r>
+        <w:t>breelri</w:t>
+      </w:r>
+      <w:proofErr w:type="spellEnd"/>
+    </w:p>
+    <w:p>
+      <w:r>
+        <w:lastRenderedPageBreak/>
+        <w:t>“Weapon Mace 1” (</w:t>
+      </w:r>
+      <w:hyperlink r:id="rId29" w:history="1">
+        <w:r>
+          <w:rPr>
+            <w:rStyle w:val="Hyperlink"/>
+          </w:rPr>
+          <w:t>https://fab.com/s/24f533ad3a54</w:t>
+        </w:r>
+      </w:hyperlink>
+      <w:r>
+        <w:t>) by Fearless Astro Star</w:t>
+      </w:r>
+    </w:p>
+    <w:p>
+      <w:r>
+        <w:t>“</w:t>
+      </w:r>
+      <w:r>
+        <w:t>Mage Staff</w:t>
+      </w:r>
+      <w:r>
+        <w:t>” (</w:t>
+      </w:r>
+      <w:hyperlink r:id="rId30" w:history="1">
+        <w:r>
+          <w:rPr>
+            <w:rStyle w:val="Hyperlink"/>
+          </w:rPr>
+          <w:t>https://fab.com/s/407c8d74e7c5</w:t>
+        </w:r>
+      </w:hyperlink>
+      <w:r>
+        <w:t xml:space="preserve">) by </w:t>
+      </w:r>
+      <w:proofErr w:type="spellStart"/>
+      <w:r>
+        <w:t>styloo</w:t>
+      </w:r>
+      <w:proofErr w:type="spellEnd"/>
+    </w:p>
+    <w:p>
+      <w:r>
+        <w:t>“</w:t>
+      </w:r>
+      <w:r>
+        <w:t>Stylized magic staff of Water</w:t>
+      </w:r>
+      <w:r>
+        <w:t>” (</w:t>
+      </w:r>
+      <w:hyperlink r:id="rId31" w:history="1">
+        <w:r>
+          <w:rPr>
+            <w:rStyle w:val="Hyperlink"/>
+          </w:rPr>
+          <w:t>https://fab.com/s/2a4ce7b32c11</w:t>
+        </w:r>
+      </w:hyperlink>
+      <w:r>
+        <w:t>) by LOLIPOP</w:t>
       </w:r>
     </w:p>
     <w:sectPr>
@@ -1024,7 +1407,6 @@
   <w:style w:type="character" w:default="1" w:styleId="DefaultParagraphFont">
     <w:name w:val="Default Paragraph Font"/>
     <w:uiPriority w:val="1"/>
-    <w:semiHidden/>
     <w:unhideWhenUsed/>
   </w:style>
   <w:style w:type="table" w:default="1" w:styleId="TableNormal">

</xml_diff>

<commit_message>
Textures moved to Unity
</commit_message>
<xml_diff>
--- a/Acquired Asset Originals/Asset Credits.docx
+++ b/Acquired Asset Originals/Asset Credits.docx
@@ -29,7 +29,14 @@
           <w:b/>
           <w:bCs/>
         </w:rPr>
-        <w:t>Fab/</w:t>
+        <w:t>Fab</w:t>
+      </w:r>
+      <w:r>
+        <w:rPr>
+          <w:b/>
+          <w:bCs/>
+        </w:rPr>
+        <w:t xml:space="preserve"> &amp; </w:t>
       </w:r>
       <w:proofErr w:type="spellStart"/>
       <w:r>
@@ -529,6 +536,28 @@
     </w:p>
     <w:p>
       <w:r>
+        <w:t>"Simple animated book" (</w:t>
+      </w:r>
+      <w:hyperlink r:id="rId22" w:history="1">
+        <w:r>
+          <w:rPr>
+            <w:rStyle w:val="Hyperlink"/>
+          </w:rPr>
+          <w:t>https://skfb.ly/6WUJO</w:t>
+        </w:r>
+      </w:hyperlink>
+      <w:r>
+        <w:t>)</w:t>
+      </w:r>
+      <w:r>
+        <w:t xml:space="preserve"> </w:t>
+      </w:r>
+      <w:r>
+        <w:t>by ZIFS</w:t>
+      </w:r>
+    </w:p>
+    <w:p>
+      <w:r>
         <w:t>“</w:t>
       </w:r>
       <w:r>
@@ -537,7 +566,7 @@
       <w:r>
         <w:t>” (</w:t>
       </w:r>
-      <w:hyperlink r:id="rId22" w:history="1">
+      <w:hyperlink r:id="rId23" w:history="1">
         <w:r>
           <w:rPr>
             <w:rStyle w:val="Hyperlink"/>
@@ -559,7 +588,7 @@
       <w:r>
         <w:t>” (</w:t>
       </w:r>
-      <w:hyperlink r:id="rId23" w:history="1">
+      <w:hyperlink r:id="rId24" w:history="1">
         <w:r>
           <w:rPr>
             <w:rStyle w:val="Hyperlink"/>
@@ -589,7 +618,7 @@
       <w:r>
         <w:t>” (</w:t>
       </w:r>
-      <w:hyperlink r:id="rId24" w:history="1">
+      <w:hyperlink r:id="rId25" w:history="1">
         <w:r>
           <w:rPr>
             <w:rStyle w:val="Hyperlink"/>
@@ -619,7 +648,7 @@
       <w:r>
         <w:t>” (</w:t>
       </w:r>
-      <w:hyperlink r:id="rId25" w:history="1">
+      <w:hyperlink r:id="rId26" w:history="1">
         <w:r>
           <w:rPr>
             <w:rStyle w:val="Hyperlink"/>
@@ -652,7 +681,7 @@
       <w:r>
         <w:t>” (</w:t>
       </w:r>
-      <w:hyperlink r:id="rId26" w:history="1">
+      <w:hyperlink r:id="rId27" w:history="1">
         <w:r>
           <w:rPr>
             <w:rStyle w:val="Hyperlink"/>
@@ -680,7 +709,7 @@
       <w:r>
         <w:t>” (</w:t>
       </w:r>
-      <w:hyperlink r:id="rId27" w:history="1">
+      <w:hyperlink r:id="rId28" w:history="1">
         <w:r>
           <w:rPr>
             <w:rStyle w:val="Hyperlink"/>
@@ -699,9 +728,10 @@
     </w:p>
     <w:p>
       <w:r>
+        <w:lastRenderedPageBreak/>
         <w:t>“Runic Sword” (</w:t>
       </w:r>
-      <w:hyperlink r:id="rId28" w:history="1">
+      <w:hyperlink r:id="rId29" w:history="1">
         <w:r>
           <w:rPr>
             <w:rStyle w:val="Hyperlink"/>
@@ -720,7 +750,6 @@
     </w:p>
     <w:p>
       <w:r>
-        <w:lastRenderedPageBreak/>
         <w:t>“</w:t>
       </w:r>
       <w:r>
@@ -729,7 +758,7 @@
       <w:r>
         <w:t>” (</w:t>
       </w:r>
-      <w:hyperlink r:id="rId29" w:history="1">
+      <w:hyperlink r:id="rId30" w:history="1">
         <w:r>
           <w:rPr>
             <w:rStyle w:val="Hyperlink"/>
@@ -756,7 +785,7 @@
       <w:r>
         <w:t>” (</w:t>
       </w:r>
-      <w:hyperlink r:id="rId30" w:history="1">
+      <w:hyperlink r:id="rId31" w:history="1">
         <w:r>
           <w:rPr>
             <w:rStyle w:val="Hyperlink"/>
@@ -777,7 +806,7 @@
       <w:r>
         <w:t>“Weapon Mace 1” (</w:t>
       </w:r>
-      <w:hyperlink r:id="rId31" w:history="1">
+      <w:hyperlink r:id="rId32" w:history="1">
         <w:r>
           <w:rPr>
             <w:rStyle w:val="Hyperlink"/>
@@ -799,7 +828,7 @@
       <w:r>
         <w:t>” (</w:t>
       </w:r>
-      <w:hyperlink r:id="rId32" w:history="1">
+      <w:hyperlink r:id="rId33" w:history="1">
         <w:r>
           <w:rPr>
             <w:rStyle w:val="Hyperlink"/>
@@ -826,7 +855,7 @@
       <w:r>
         <w:t>” (</w:t>
       </w:r>
-      <w:hyperlink r:id="rId33" w:history="1">
+      <w:hyperlink r:id="rId34" w:history="1">
         <w:r>
           <w:rPr>
             <w:rStyle w:val="Hyperlink"/>

</xml_diff>